<commit_message>
Allinea anni di esperienza a 10 in CV PDF/DOCX, CV una pagina e portfolio statico
</commit_message>
<xml_diff>
--- a/alessandrofratello/cv_alex.docx
+++ b/alessandrofratello/cv_alex.docx
@@ -51,7 +51,7 @@
         </w:rPr>
         <w:t xml:space="preserve">  |  </w:t>
       </w:r>
-      <w:hyperlink w:history="1" r:id="rIdnp5eglxp9onurlujhc54_">
+      <w:hyperlink w:history="1" r:id="rIdp7h5otuwdgz-ebmp3djim">
         <w:r>
           <w:rPr>
             <w:color w:val="1A1A1A"/>
@@ -65,7 +65,7 @@
         </w:rPr>
         <w:t xml:space="preserve">  |  </w:t>
       </w:r>
-      <w:hyperlink w:history="1" r:id="rIdqmofk4vrt8icdswpwyfny">
+      <w:hyperlink w:history="1" r:id="rIdz1rhtzbtndiophwkkmgip">
         <w:r>
           <w:rPr>
             <w:color w:val="1A1A1A"/>
@@ -79,7 +79,7 @@
         </w:rPr>
         <w:t xml:space="preserve">  |  </w:t>
       </w:r>
-      <w:hyperlink w:history="1" r:id="rIdhbjmxa9wfgdmodxryzmxl">
+      <w:hyperlink w:history="1" r:id="rIdxasrctqgfjfkfo8ro_5qp">
         <w:r>
           <w:rPr>
             <w:color w:val="1A1A1A"/>
@@ -93,7 +93,7 @@
         </w:rPr>
         <w:t xml:space="preserve">  |  </w:t>
       </w:r>
-      <w:hyperlink w:history="1" r:id="rIdiixeioxxdzxtl8mr8vx75">
+      <w:hyperlink w:history="1" r:id="rIdw08ncv9lu3v6ldzuamwbi">
         <w:r>
           <w:rPr>
             <w:color w:val="1A1A1A"/>
@@ -145,7 +145,7 @@
           <w:sz w:val="21"/>
           <w:szCs w:val="21"/>
         </w:rPr>
-        <w:t xml:space="preserve">Sviluppatore web full-stack con 3-5 anni di esperienza nella progettazione e realizzazione di soluzioni digitali per PMI e startup. Specializzato in sviluppo WordPress, creazione di web app moderne e integrazione di soluzioni AI per l'automazione dei processi di business. Approccio orientato ai risultati, con capacità comprovate di gestione completa del ciclo di sviluppo, dalla definizione dei requisiti al deployment. Costantemente aggiornato sulle tecnologie emergenti del settore.</w:t>
+        <w:t xml:space="preserve">Sviluppatore web full-stack con 10 anni di esperienza nella progettazione e realizzazione di soluzioni digitali per PMI e startup. Specializzato in sviluppo WordPress, creazione di web app moderne e integrazione di soluzioni AI per l'automazione dei processi di business. Approccio orientato ai risultati, con capacità comprovate di gestione completa del ciclo di sviluppo, dalla definizione dei requisiti al deployment. Costantemente aggiornato sulle tecnologie emergenti del settore.</w:t>
       </w:r>
     </w:p>
     <w:p>
@@ -246,7 +246,7 @@
         </w:rPr>
         <w:t xml:space="preserve"> — </w:t>
       </w:r>
-      <w:hyperlink w:history="1" r:id="rId8kub_ax0ncok_imprsybm">
+      <w:hyperlink w:history="1" r:id="rIdimh_dxhgildiwjzugwmjn">
         <w:r>
           <w:rPr>
             <w:rFonts w:ascii="Calibri" w:cs="Calibri" w:eastAsia="Calibri" w:hAnsi="Calibri"/>
@@ -399,7 +399,7 @@
         </w:rPr>
         <w:t xml:space="preserve"> — </w:t>
       </w:r>
-      <w:hyperlink w:history="1" r:id="rIdg0fd3clujlomsv4gfbxjt">
+      <w:hyperlink w:history="1" r:id="rIduedowtbtpsbsjtlgp0fql">
         <w:r>
           <w:rPr>
             <w:rFonts w:ascii="Calibri" w:cs="Calibri" w:eastAsia="Calibri" w:hAnsi="Calibri"/>
@@ -552,7 +552,7 @@
         </w:rPr>
         <w:t xml:space="preserve"> — </w:t>
       </w:r>
-      <w:hyperlink w:history="1" r:id="rId6u6it2ddw-yuzybdtiwny">
+      <w:hyperlink w:history="1" r:id="rIdm4p1lkjoqdviyyxqrl4fj">
         <w:r>
           <w:rPr>
             <w:rFonts w:ascii="Calibri" w:cs="Calibri" w:eastAsia="Calibri" w:hAnsi="Calibri"/>

</xml_diff>

<commit_message>
CV Word: foto profilo e QR verso il sito nell'intestazione
</commit_message>
<xml_diff>
--- a/alessandrofratello/cv_alex.docx
+++ b/alessandrofratello/cv_alex.docx
@@ -2,106 +2,258 @@
 <file path=word/document.xml><?xml version="1.0" encoding="utf-8"?>
 <w:document xmlns:wpc="http://schemas.microsoft.com/office/word/2010/wordprocessingCanvas" xmlns:mc="http://schemas.openxmlformats.org/markup-compatibility/2006" xmlns:o="urn:schemas-microsoft-com:office:office" xmlns:r="http://schemas.openxmlformats.org/officeDocument/2006/relationships" xmlns:m="http://schemas.openxmlformats.org/officeDocument/2006/math" xmlns:v="urn:schemas-microsoft-com:vml" xmlns:wp14="http://schemas.microsoft.com/office/word/2010/wordprocessingDrawing" xmlns:wp="http://schemas.openxmlformats.org/drawingml/2006/wordprocessingDrawing" xmlns:w10="urn:schemas-microsoft-com:office:word" xmlns:w="http://schemas.openxmlformats.org/wordprocessingml/2006/main" xmlns:w14="http://schemas.microsoft.com/office/word/2010/wordml" xmlns:w15="http://schemas.microsoft.com/office/word/2012/wordml" xmlns:wpg="http://schemas.microsoft.com/office/word/2010/wordprocessingGroup" xmlns:wpi="http://schemas.microsoft.com/office/word/2010/wordprocessingInk" xmlns:wne="http://schemas.microsoft.com/office/word/2006/wordml" xmlns:wps="http://schemas.microsoft.com/office/word/2010/wordprocessingShape" xmlns:cx="http://schemas.microsoft.com/office/drawing/2014/chartex" xmlns:cx1="http://schemas.microsoft.com/office/drawing/2015/9/8/chartex" xmlns:cx2="http://schemas.microsoft.com/office/drawing/2015/10/21/chartex" xmlns:cx3="http://schemas.microsoft.com/office/drawing/2016/5/9/chartex" xmlns:cx4="http://schemas.microsoft.com/office/drawing/2016/5/10/chartex" xmlns:cx5="http://schemas.microsoft.com/office/drawing/2016/5/11/chartex" xmlns:cx6="http://schemas.microsoft.com/office/drawing/2016/5/12/chartex" xmlns:cx7="http://schemas.microsoft.com/office/drawing/2016/5/13/chartex" xmlns:cx8="http://schemas.microsoft.com/office/drawing/2016/5/14/chartex" xmlns:aink="http://schemas.microsoft.com/office/drawing/2016/ink" xmlns:am3d="http://schemas.microsoft.com/office/drawing/2017/model3d" xmlns:w16cex="http://schemas.microsoft.com/office/word/2018/wordml/cex" xmlns:w16cid="http://schemas.microsoft.com/office/word/2016/wordml/cid" xmlns:w16="http://schemas.microsoft.com/office/word/2018/wordml" xmlns:w16sdtdh="http://schemas.microsoft.com/office/word/2020/wordml/sdtdatahash" xmlns:w16se="http://schemas.microsoft.com/office/word/2015/wordml/symex" mc:Ignorable="w14 w15 wp14">
   <w:body>
-    <w:p>
-      <w:pPr>
-        <w:spacing w:after="40"/>
-      </w:pPr>
-      <w:r>
-        <w:rPr>
-          <w:rFonts w:ascii="Calibri" w:cs="Calibri" w:eastAsia="Calibri" w:hAnsi="Calibri"/>
-          <w:b/>
-          <w:bCs/>
-          <w:color w:val="1A1A1A"/>
-          <w:spacing w:val="12"/>
-          <w:sz w:val="46"/>
-          <w:szCs w:val="46"/>
-        </w:rPr>
-        <w:t xml:space="preserve">ALESSANDRO FRATELLO</w:t>
-      </w:r>
-    </w:p>
-    <w:p>
-      <w:pPr>
-        <w:spacing w:after="80"/>
-      </w:pPr>
-      <w:r>
-        <w:rPr>
-          <w:rFonts w:ascii="Calibri" w:cs="Calibri" w:eastAsia="Calibri" w:hAnsi="Calibri"/>
-          <w:b/>
-          <w:bCs/>
-          <w:color w:val="E8480C"/>
-          <w:sz w:val="24"/>
-          <w:szCs w:val="24"/>
-        </w:rPr>
-        <w:t xml:space="preserve">Sviluppatore Web &amp; AI Specialist</w:t>
-      </w:r>
-    </w:p>
-    <w:p>
-      <w:pPr>
-        <w:spacing w:after="60"/>
-      </w:pPr>
-      <w:r>
-        <w:rPr>
-          <w:color w:val="5A5A5A"/>
-        </w:rPr>
-        <w:t xml:space="preserve">Foggia (FG), Italia</w:t>
-      </w:r>
-      <w:r>
-        <w:rPr>
-          <w:color w:val="5A5A5A"/>
-        </w:rPr>
-        <w:t xml:space="preserve">  |  </w:t>
-      </w:r>
-      <w:hyperlink w:history="1" r:id="rIdp7h5otuwdgz-ebmp3djim">
-        <w:r>
-          <w:rPr>
-            <w:color w:val="1A1A1A"/>
-          </w:rPr>
-          <w:t xml:space="preserve">alexfratello1982@gmail.com</w:t>
-        </w:r>
-      </w:hyperlink>
-      <w:r>
-        <w:rPr>
-          <w:color w:val="5A5A5A"/>
-        </w:rPr>
-        <w:t xml:space="preserve">  |  </w:t>
-      </w:r>
-      <w:hyperlink w:history="1" r:id="rIdz1rhtzbtndiophwkkmgip">
-        <w:r>
-          <w:rPr>
-            <w:color w:val="1A1A1A"/>
-          </w:rPr>
-          <w:t xml:space="preserve">331 718 1509</w:t>
-        </w:r>
-      </w:hyperlink>
-      <w:r>
-        <w:rPr>
-          <w:color w:val="5A5A5A"/>
-        </w:rPr>
-        <w:t xml:space="preserve">  |  </w:t>
-      </w:r>
-      <w:hyperlink w:history="1" r:id="rIdxasrctqgfjfkfo8ro_5qp">
-        <w:r>
-          <w:rPr>
-            <w:color w:val="1A1A1A"/>
-          </w:rPr>
-          <w:t xml:space="preserve">linkedin.com/in/alex-fratello-0b1206293</w:t>
-        </w:r>
-      </w:hyperlink>
-      <w:r>
-        <w:rPr>
-          <w:color w:val="5A5A5A"/>
-        </w:rPr>
-        <w:t xml:space="preserve">  |  </w:t>
-      </w:r>
-      <w:hyperlink w:history="1" r:id="rIdw08ncv9lu3v6ldzuamwbi">
-        <w:r>
-          <w:rPr>
-            <w:color w:val="1A1A1A"/>
-          </w:rPr>
-          <w:t xml:space="preserve">sevedo.it</w:t>
-        </w:r>
-      </w:hyperlink>
-    </w:p>
+    <w:tbl>
+      <w:tblPr>
+        <w:tblW w:w="10026" w:type="dxa"/>
+        <w:tblLayout w:type="fixed"/>
+        <w:tblBorders>
+          <w:top w:val="none" w:sz="0" w:space="0" w:color="auto"/>
+          <w:left w:val="none" w:sz="0" w:space="0" w:color="auto"/>
+          <w:bottom w:val="none" w:sz="0" w:space="0" w:color="auto"/>
+          <w:right w:val="none" w:sz="0" w:space="0" w:color="auto"/>
+          <w:insideH w:val="none" w:sz="0" w:space="0" w:color="auto"/>
+          <w:insideV w:val="none" w:sz="0" w:space="0" w:color="auto"/>
+        </w:tblBorders>
+        <w:tblCellMar>
+          <w:top w:w="0" w:type="dxa"/>
+          <w:left w:w="0" w:type="dxa"/>
+          <w:bottom w:w="0" w:type="dxa"/>
+          <w:right w:w="0" w:type="dxa"/>
+        </w:tblCellMar>
+      </w:tblPr>
+      <w:tblGrid>
+        <w:gridCol w:w="6900"/>
+        <w:gridCol w:w="1560"/>
+        <w:gridCol w:w="1566"/>
+      </w:tblGrid>
+      <w:tr>
+        <w:tc>
+          <w:tcPr>
+            <w:tcW w:w="6900" w:type="dxa"/>
+            <w:vAlign w:val="top"/>
+          </w:tcPr>
+          <w:p>
+            <w:pPr>
+              <w:spacing w:after="40"/>
+            </w:pPr>
+            <w:r>
+              <w:rPr>
+                <w:rFonts w:ascii="Calibri" w:cs="Calibri" w:eastAsia="Calibri" w:hAnsi="Calibri"/>
+                <w:b/>
+                <w:bCs/>
+                <w:color w:val="1A1A1A"/>
+                <w:spacing w:val="12"/>
+                <w:sz w:val="46"/>
+                <w:szCs w:val="46"/>
+              </w:rPr>
+              <w:t xml:space="preserve">ALESSANDRO FRATELLO</w:t>
+            </w:r>
+          </w:p>
+          <w:p>
+            <w:pPr>
+              <w:spacing w:after="80"/>
+            </w:pPr>
+            <w:r>
+              <w:rPr>
+                <w:rFonts w:ascii="Calibri" w:cs="Calibri" w:eastAsia="Calibri" w:hAnsi="Calibri"/>
+                <w:b/>
+                <w:bCs/>
+                <w:color w:val="E8480C"/>
+                <w:sz w:val="24"/>
+                <w:szCs w:val="24"/>
+              </w:rPr>
+              <w:t xml:space="preserve">Sviluppatore Web &amp; AI Specialist</w:t>
+            </w:r>
+          </w:p>
+          <w:p>
+            <w:pPr>
+              <w:spacing w:after="60"/>
+            </w:pPr>
+            <w:r>
+              <w:rPr>
+                <w:color w:val="5A5A5A"/>
+              </w:rPr>
+              <w:t xml:space="preserve">Foggia (FG), Italia</w:t>
+            </w:r>
+            <w:r>
+              <w:rPr>
+                <w:color w:val="5A5A5A"/>
+              </w:rPr>
+              <w:t xml:space="preserve">  |  </w:t>
+            </w:r>
+            <w:hyperlink w:history="1" r:id="rIdp7h5otuwdgz-ebmp3djim">
+              <w:r>
+                <w:rPr>
+                  <w:color w:val="1A1A1A"/>
+                </w:rPr>
+                <w:t xml:space="preserve">alexfratello1982@gmail.com</w:t>
+              </w:r>
+            </w:hyperlink>
+            <w:r>
+              <w:rPr>
+                <w:color w:val="5A5A5A"/>
+              </w:rPr>
+              <w:t xml:space="preserve">  |  </w:t>
+            </w:r>
+            <w:hyperlink w:history="1" r:id="rIdz1rhtzbtndiophwkkmgip">
+              <w:r>
+                <w:rPr>
+                  <w:color w:val="1A1A1A"/>
+                </w:rPr>
+                <w:t xml:space="preserve">331 718 1509</w:t>
+              </w:r>
+            </w:hyperlink>
+            <w:r>
+              <w:rPr>
+                <w:color w:val="5A5A5A"/>
+              </w:rPr>
+              <w:t xml:space="preserve">  |  </w:t>
+            </w:r>
+            <w:hyperlink w:history="1" r:id="rIdxasrctqgfjfkfo8ro_5qp">
+              <w:r>
+                <w:rPr>
+                  <w:color w:val="1A1A1A"/>
+                </w:rPr>
+                <w:t xml:space="preserve">linkedin.com/in/alex-fratello-0b1206293</w:t>
+              </w:r>
+            </w:hyperlink>
+            <w:r>
+              <w:rPr>
+                <w:color w:val="5A5A5A"/>
+              </w:rPr>
+              <w:t xml:space="preserve">  |  </w:t>
+            </w:r>
+            <w:hyperlink w:history="1" r:id="rIdw08ncv9lu3v6ldzuamwbi">
+              <w:r>
+                <w:rPr>
+                  <w:color w:val="1A1A1A"/>
+                </w:rPr>
+                <w:t xml:space="preserve">sevedo.it</w:t>
+              </w:r>
+            </w:hyperlink>
+          </w:p>
+        </w:tc>
+        <w:tc>
+          <w:tcPr>
+            <w:tcW w:w="1560" w:type="dxa"/>
+            <w:vAlign w:val="center"/>
+          </w:tcPr>
+          <w:p>
+            <w:pPr>
+              <w:jc w:val="center"/>
+              <w:spacing w:before="0" w:after="0"/>
+            </w:pPr>
+            <w:r>
+              <w:drawing>
+                <wp:inline distT="0" distB="0" distL="0" distR="0">
+                  <wp:extent cx="827999" cy="827999"/>
+                  <wp:effectExtent l="0" t="0" r="0" b="0"/>
+                  <wp:docPr id="9101" name="Foto profilo" descr="Alessandro Fratello"/>
+                  <wp:cNvGraphicFramePr>
+                    <a:graphicFrameLocks xmlns:a="http://schemas.openxmlformats.org/drawingml/2006/main" noChangeAspect="1"/>
+                  </wp:cNvGraphicFramePr>
+                  <a:graphic xmlns:a="http://schemas.openxmlformats.org/drawingml/2006/main">
+                    <a:graphicData uri="http://schemas.openxmlformats.org/drawingml/2006/picture">
+                      <pic:pic xmlns:pic="http://schemas.openxmlformats.org/drawingml/2006/picture">
+                        <pic:nvPicPr>
+                          <pic:cNvPr id="9101" name="Foto profilo"/>
+                          <pic:cNvPicPr/>
+                        </pic:nvPicPr>
+                        <pic:blipFill>
+                          <a:blip r:embed="rIdFotoCv1"/>
+                          <a:stretch>
+                            <a:fillRect/>
+                          </a:stretch>
+                        </pic:blipFill>
+                        <pic:spPr>
+                          <a:xfrm>
+                            <a:off x="0" y="0"/>
+                            <a:ext cx="827999" cy="827999"/>
+                          </a:xfrm>
+                          <a:prstGeom prst="roundRect">
+                            <a:avLst>
+                              <a:gd name="adj" fmla="val 8000"/>
+                            </a:avLst>
+                          </a:prstGeom>
+                        </pic:spPr>
+                      </pic:pic>
+                    </a:graphicData>
+                  </a:graphic>
+                </wp:inline>
+              </w:drawing>
+            </w:r>
+          </w:p>
+        </w:tc>
+        <w:tc>
+          <w:tcPr>
+            <w:tcW w:w="1566" w:type="dxa"/>
+            <w:vAlign w:val="center"/>
+          </w:tcPr>
+          <w:p>
+            <w:pPr>
+              <w:jc w:val="center"/>
+              <w:spacing w:before="0" w:after="0"/>
+            </w:pPr>
+            <w:hyperlink r:id="rIdLinkCv">
+              <w:r>
+                <w:drawing>
+                  <wp:inline distT="0" distB="0" distL="0" distR="0">
+                    <wp:extent cx="540000" cy="540000"/>
+                    <wp:effectExtent l="0" t="0" r="0" b="0"/>
+                    <wp:docPr id="9102" name="QR code" descr="alessandrofratello.it"/>
+                    <wp:cNvGraphicFramePr>
+                      <a:graphicFrameLocks xmlns:a="http://schemas.openxmlformats.org/drawingml/2006/main" noChangeAspect="1"/>
+                    </wp:cNvGraphicFramePr>
+                    <a:graphic xmlns:a="http://schemas.openxmlformats.org/drawingml/2006/main">
+                      <a:graphicData uri="http://schemas.openxmlformats.org/drawingml/2006/picture">
+                        <pic:pic xmlns:pic="http://schemas.openxmlformats.org/drawingml/2006/picture">
+                          <pic:nvPicPr>
+                            <pic:cNvPr id="9102" name="QR code"/>
+                            <pic:cNvPicPr/>
+                          </pic:nvPicPr>
+                          <pic:blipFill>
+                            <a:blip r:embed="rIdQrCv1"/>
+                            <a:stretch>
+                              <a:fillRect/>
+                            </a:stretch>
+                          </pic:blipFill>
+                          <pic:spPr>
+                            <a:xfrm>
+                              <a:off x="0" y="0"/>
+                              <a:ext cx="540000" cy="540000"/>
+                            </a:xfrm>
+                            <a:prstGeom prst="rect">
+                              <a:avLst/>
+                            </a:prstGeom>
+                          </pic:spPr>
+                        </pic:pic>
+                      </a:graphicData>
+                    </a:graphic>
+                  </wp:inline>
+                </w:drawing>
+              </w:r>
+            </w:hyperlink>
+          </w:p>
+          <w:p>
+            <w:pPr>
+              <w:jc w:val="center"/>
+              <w:spacing w:before="40" w:after="0"/>
+            </w:pPr>
+            <w:r>
+              <w:rPr>
+                <w:rFonts w:ascii="Calibri" w:hAnsi="Calibri"/>
+                <w:b/>
+                <w:color w:val="5A5A5A"/>
+                <w:spacing w:val="8"/>
+                <w:sz w:val="12"/>
+                <w:szCs w:val="12"/>
+              </w:rPr>
+              <w:t xml:space="preserve">CV ONLINE</w:t>
+            </w:r>
+          </w:p>
+        </w:tc>
+      </w:tr>
+    </w:tbl>
     <w:p>
       <w:pPr>
         <w:pBdr>
@@ -1391,7 +1543,7 @@
           <w:sz w:val="18"/>
           <w:szCs w:val="18"/>
         </w:rPr>
-        <w:t xml:space="preserve">Ultimo aggiornamento: Settembre 2026</w:t>
+        <w:t xml:space="preserve">Ultimo aggiornamento: Ottobre 2026</w:t>
       </w:r>
     </w:p>
     <w:sectPr>

</xml_diff>